<commit_message>
Lab 1 Participant: dry-run fixes (step order, warnings, nav tips, pre-deploy acknowledgments)
</commit_message>
<xml_diff>
--- a/workshop-site/labs/Lab 01 - Participant.docx
+++ b/workshop-site/labs/Lab 01 - Participant.docx
@@ -524,7 +524,7 @@
         <w:t xml:space="preserve">2. </w:t>
       </w:r>
       <w:r>
-        <w:t>In the Object Manager list, find Case and click the label.</w:t>
+        <w:t>In the Object Manager list, find Case and click the label (the Object Manager list also includes Case Comment, Case Contact Role, and other Case-related objects; you want the plain "Case").</w:t>
       </w:r>
     </w:p>
     <w:p>
@@ -569,7 +569,7 @@
         <w:t xml:space="preserve">5. </w:t>
       </w:r>
       <w:r>
-        <w:t>Click back to Fields &amp; Relationships then click Type. Scroll down to the "Case Type Picklist Values" section. Notice the existing values already include MTA's transit values. These were pre-deployed for time. We'll tour them in Part 2.2.</w:t>
+        <w:t>Click back to Fields &amp; Relationships. Priority stays open here (you'll return to it in Part 2.1). You'll tour the Type picklist in Part 2.2.</w:t>
       </w:r>
     </w:p>
     <w:p>
@@ -700,10 +700,7 @@
         <w:ind w:left="680" w:hanging="227"/>
       </w:pPr>
       <w:r>
-        <w:t xml:space="preserve">• </w:t>
-      </w:r>
-      <w:r>
-        <w:t>P1 - Critical</w:t>
+        <w:t xml:space="preserve">• P1 - Critical</w:t>
       </w:r>
     </w:p>
     <w:p>
@@ -712,10 +709,7 @@
         <w:ind w:left="680" w:hanging="227"/>
       </w:pPr>
       <w:r>
-        <w:t xml:space="preserve">• </w:t>
-      </w:r>
-      <w:r>
-        <w:t>P2 - High</w:t>
+        <w:t xml:space="preserve">• P2 - High</w:t>
       </w:r>
     </w:p>
     <w:p>
@@ -724,10 +718,7 @@
         <w:ind w:left="680" w:hanging="227"/>
       </w:pPr>
       <w:r>
-        <w:t xml:space="preserve">• </w:t>
-      </w:r>
-      <w:r>
-        <w:t>P3 - Medium</w:t>
+        <w:t xml:space="preserve">• P3 - Medium</w:t>
       </w:r>
     </w:p>
     <w:p>
@@ -736,10 +727,7 @@
         <w:ind w:left="680" w:hanging="227"/>
       </w:pPr>
       <w:r>
-        <w:t xml:space="preserve">• </w:t>
-      </w:r>
-      <w:r>
-        <w:t>P4 - Low</w:t>
+        <w:t xml:space="preserve">• P4 - Low</w:t>
       </w:r>
     </w:p>
     <w:p>
@@ -785,7 +773,7 @@
         <w:t xml:space="preserve">5. </w:t>
       </w:r>
       <w:r>
-        <w:t>You're back on the Priority detail page. Now deactivate the existing values you no longer want:</w:t>
+        <w:t>You're back on the Priority detail page. First, set P3 - Medium as the default: find P3 - Medium in the Active Values section, click Edit, check the Default checkbox, then Save. Then deactivate the existing values you no longer want:</w:t>
       </w:r>
     </w:p>
     <w:p>
@@ -794,10 +782,7 @@
         <w:ind w:left="680" w:hanging="227"/>
       </w:pPr>
       <w:r>
-        <w:t xml:space="preserve">• </w:t>
-      </w:r>
-      <w:r>
-        <w:t>Click Deactivate next to High then confirm.</w:t>
+        <w:t xml:space="preserve">• Click Deactivate next to High then confirm.</w:t>
       </w:r>
     </w:p>
     <w:p>
@@ -806,10 +791,7 @@
         <w:ind w:left="680" w:hanging="227"/>
       </w:pPr>
       <w:r>
-        <w:t xml:space="preserve">• </w:t>
-      </w:r>
-      <w:r>
-        <w:t>Click Deactivate next to Medium then confirm.</w:t>
+        <w:t xml:space="preserve">• Click Deactivate next to Medium then confirm.</w:t>
       </w:r>
     </w:p>
     <w:p>
@@ -818,10 +800,7 @@
         <w:ind w:left="680" w:hanging="227"/>
       </w:pPr>
       <w:r>
-        <w:t xml:space="preserve">• </w:t>
-      </w:r>
-      <w:r>
-        <w:t>Click Deactivate next to Low then confirm.</w:t>
+        <w:t xml:space="preserve">• Click Deactivate next to Low then confirm.</w:t>
       </w:r>
     </w:p>
     <w:p>
@@ -837,7 +816,7 @@
         <w:t xml:space="preserve">Watch out: </w:t>
       </w:r>
       <w:r>
-        <w:t>Deactivating a value that's referenced by existing records is allowed. Salesforce keeps those records intact, marks the value with an asterisk in the picklist editor, and continues to display it on existing records. New records can no longer pick the deactivated values.</w:t>
+        <w:t>Click Deactivate once, confirm, and wait for the value to move to Inactive Values. Clicking again before it finishes causes a "modified by another user" or "page no longer exists" error. Deactivating a value that's referenced by existing records is allowed. Salesforce keeps those records intact, marks the value with an asterisk in the picklist editor, and continues to display it on existing records. New records can no longer pick the deactivated values.</w:t>
       </w:r>
     </w:p>
     <w:p>
@@ -852,7 +831,7 @@
         <w:t xml:space="preserve">6. </w:t>
       </w:r>
       <w:r>
-        <w:t>Now set P3 - Medium as the default. Find P3 - Medium in the Active Values section then click Edit then check the Default checkbox then Save.</w:t>
+        <w:t>Verify P3 - Medium shows as the default in the Active Values section (an asterisk or (default) marker).</w:t>
       </w:r>
     </w:p>
     <w:p>
@@ -900,7 +879,7 @@
         <w:t xml:space="preserve">1. </w:t>
       </w:r>
       <w:r>
-        <w:t>Scroll to the Case Type Picklist Values section.</w:t>
+        <w:t>Navigate to Setup &gt; Object Manager &gt; Case &gt; Fields &amp; Relationships &gt; Type if you're not already there. Scroll to the Case Type Picklist Values section.</w:t>
       </w:r>
     </w:p>
     <w:p>
@@ -996,7 +975,7 @@
         <w:t xml:space="preserve">1. </w:t>
       </w:r>
       <w:r>
-        <w:t>Click the New button.</w:t>
+        <w:t>In Fields &amp; Relationships, click the New button (top-right of the field list).</w:t>
       </w:r>
     </w:p>
     <w:p>
@@ -1226,7 +1205,7 @@
     </w:p>
     <w:p>
       <w:r>
-        <w:t>Case Record Types require a Support Process. Salesforce uses this to control which Status values are valid for the Record Type.</w:t>
+        <w:t>Case Record Types require a Support Process. Salesforce uses this to control which Status values are valid for the Record Type. Navigate to Setup &gt; Quick Find &gt; Support Processes (not in Object Manager).</w:t>
       </w:r>
     </w:p>
     <w:p>
@@ -1546,7 +1525,7 @@
         <w:t xml:space="preserve">Watch out: </w:t>
       </w:r>
       <w:r>
-        <w:t>The default is zero profiles having access. If you don't explicitly check System Administrator here, you'll build the Record Type but won't be able to use it anywhere.</w:t>
+        <w:t>In this org every profile is checked by default. Clear the Make Available header checkbox to deselect all, then check only the row for System Administrator.</w:t>
       </w:r>
     </w:p>
     <w:p>
@@ -2140,10 +2119,7 @@
         <w:ind w:left="680" w:hanging="227"/>
       </w:pPr>
       <w:r>
-        <w:t xml:space="preserve">• </w:t>
-      </w:r>
-      <w:r>
-        <w:t>Type</w:t>
+        <w:t xml:space="preserve">• Type</w:t>
       </w:r>
     </w:p>
     <w:p>
@@ -2152,10 +2128,7 @@
         <w:ind w:left="680" w:hanging="227"/>
       </w:pPr>
       <w:r>
-        <w:t xml:space="preserve">• </w:t>
-      </w:r>
-      <w:r>
-        <w:t>Priority</w:t>
+        <w:t xml:space="preserve">• Priority</w:t>
       </w:r>
     </w:p>
     <w:p>
@@ -2164,10 +2137,7 @@
         <w:ind w:left="680" w:hanging="227"/>
       </w:pPr>
       <w:r>
-        <w:t xml:space="preserve">• </w:t>
-      </w:r>
-      <w:r>
-        <w:t>Status</w:t>
+        <w:t xml:space="preserve">• Status</w:t>
       </w:r>
     </w:p>
     <w:p>
@@ -2176,10 +2146,7 @@
         <w:ind w:left="680" w:hanging="227"/>
       </w:pPr>
       <w:r>
-        <w:t xml:space="preserve">• </w:t>
-      </w:r>
-      <w:r>
-        <w:t>Reported Date/Time</w:t>
+        <w:t xml:space="preserve">• Reported Date/Time</w:t>
       </w:r>
     </w:p>
     <w:p>
@@ -2188,10 +2155,7 @@
         <w:ind w:left="680" w:hanging="227"/>
       </w:pPr>
       <w:r>
-        <w:t xml:space="preserve">• </w:t>
-      </w:r>
-      <w:r>
-        <w:t>Asset</w:t>
+        <w:t xml:space="preserve">• Asset</w:t>
       </w:r>
     </w:p>
     <w:p>
@@ -2389,7 +2353,7 @@
         <w:t xml:space="preserve">2. </w:t>
       </w:r>
       <w:r>
-        <w:t>For each related list EXCEPT Case Comments, Case History, Attachments, and Work Orders, hover over it and click the minus icon to remove it from the layout.</w:t>
+        <w:t>For each related list EXCEPT Case Comments, Case History, and Attachments, hover over it and click the minus icon to remove it from the layout.</w:t>
       </w:r>
     </w:p>
     <w:p>
@@ -2493,10 +2457,7 @@
         <w:ind w:left="680" w:hanging="227"/>
       </w:pPr>
       <w:r>
-        <w:t xml:space="preserve">• </w:t>
-      </w:r>
-      <w:r>
-        <w:t>Case Number</w:t>
+        <w:t xml:space="preserve">• Case Number</w:t>
       </w:r>
     </w:p>
     <w:p>
@@ -2505,10 +2466,7 @@
         <w:ind w:left="680" w:hanging="227"/>
       </w:pPr>
       <w:r>
-        <w:t xml:space="preserve">• </w:t>
-      </w:r>
-      <w:r>
-        <w:t>Type</w:t>
+        <w:t xml:space="preserve">• Type</w:t>
       </w:r>
     </w:p>
     <w:p>
@@ -2517,10 +2475,7 @@
         <w:ind w:left="680" w:hanging="227"/>
       </w:pPr>
       <w:r>
-        <w:t xml:space="preserve">• </w:t>
-      </w:r>
-      <w:r>
-        <w:t>Priority</w:t>
+        <w:t xml:space="preserve">• Priority</w:t>
       </w:r>
     </w:p>
     <w:p>
@@ -2529,10 +2484,7 @@
         <w:ind w:left="680" w:hanging="227"/>
       </w:pPr>
       <w:r>
-        <w:t xml:space="preserve">• </w:t>
-      </w:r>
-      <w:r>
-        <w:t>Status</w:t>
+        <w:t xml:space="preserve">• Status</w:t>
       </w:r>
     </w:p>
     <w:p>
@@ -2541,10 +2493,7 @@
         <w:ind w:left="680" w:hanging="227"/>
       </w:pPr>
       <w:r>
-        <w:t xml:space="preserve">• </w:t>
-      </w:r>
-      <w:r>
-        <w:t>Reported Date/Time</w:t>
+        <w:t xml:space="preserve">• Reported Date/Time</w:t>
       </w:r>
     </w:p>
     <w:p>
@@ -2974,7 +2923,7 @@
         <w:t xml:space="preserve">3. </w:t>
       </w:r>
       <w:r>
-        <w:t>Drag Reported Date/Time onto the canvas. A natural placement is inside the existing Case Details section (if present) or at the top of the main field section.</w:t>
+        <w:t>Confirm Reported Date/Time is already on the canvas (Part 3.1's field wizard may have added it automatically). If it's not there, drag it onto the canvas. A natural placement is inside the existing Case Details section (if present) or at the top of the main field section.</w:t>
       </w:r>
     </w:p>
     <w:p>
@@ -3016,7 +2965,7 @@
         <w:t xml:space="preserve">2. </w:t>
       </w:r>
       <w:r>
-        <w:t>Drag Resolution Notes onto the canvas. Place it near the bottom of the main field area (below Description or in a resolution-related section).</w:t>
+        <w:t>Confirm Resolution Notes is already on the canvas (Part 3.2's field wizard may have added it automatically). If it's not there, drag it onto the canvas. Place it near the bottom of the main field area (below Description or in a resolution-related section).</w:t>
       </w:r>
     </w:p>
     <w:p>
@@ -3238,7 +3187,7 @@
         <w:t xml:space="preserve">Golden Record spec: </w:t>
       </w:r>
       <w:r>
-        <w:t>Your Golden Record will have: Record Type = NYCT, Priority = P3 - Medium, Status = New, Type = Track Defect, Case Origin = Phone, Reported Date/Time = (auto), Subject = "Golden Record: Workshop reference case", Contact Name = (one of your workshop org's contacts; agency-aligned contacts like Marcus Chen, Priya Patel, Elena Rodriguez, or James O'Brien are pre-populated if available), Account Name = "MTA New York City Transit".</w:t>
+        <w:t>Your Golden Record will have: Record Type = NYCT, Priority = P3 - Medium, Status = New, Type = Track Defect, Case Origin = Phone, Reported Date/Time = (auto), Subject = "Golden Record: Workshop reference case", Contact Name = (any contact from your workshop org; Lab 1.5 later loads MTA agency-aligned contacts: Marcus Chen for NYCT, Priya Patel for LIRR, Elena Rodriguez for MNR, James O'Brien for B&amp;T), Account Name = "MTA New York City Transit".</w:t>
       </w:r>
     </w:p>
     <w:p>
@@ -3463,7 +3412,7 @@
         <w:t xml:space="preserve">9. </w:t>
       </w:r>
       <w:r>
-        <w:t>Contact Name: click into the field. Type a few letters and let the picker suggest. Pick any contact from the list. (Your workshop org includes sample contacts. If you'd like your Golden Record to feel MTA-specific, pick one of the agency-aligned contacts pre-populated for you: names like Marcus Chen, Priya Patel, Elena Rodriguez, or James O'Brien.)</w:t>
+        <w:t>Contact Name: click into the field. Type a few letters and let the picker suggest. Right now the org has no MTA-specific contacts (Lab 1.5 loads them later). Pick any contact from the list for now. After Lab 1.5 runs, you can switch this field to an MTA agency-aligned contact: Marcus Chen (NYCT), Priya Patel (LIRR), Elena Rodriguez (MNR), or James O'Brien (B&amp;T).)</w:t>
       </w:r>
     </w:p>
     <w:p>
@@ -3549,10 +3498,7 @@
         <w:ind w:left="680" w:hanging="227"/>
       </w:pPr>
       <w:r>
-        <w:t xml:space="preserve">• </w:t>
-      </w:r>
-      <w:r>
-        <w:t>Priority shows P3 - Medium (proves Priority customization)</w:t>
+        <w:t xml:space="preserve">• Priority shows P3 - Medium (proves Priority customization)</w:t>
       </w:r>
     </w:p>
     <w:p>
@@ -3561,10 +3507,7 @@
         <w:ind w:left="680" w:hanging="227"/>
       </w:pPr>
       <w:r>
-        <w:t xml:space="preserve">• </w:t>
-      </w:r>
-      <w:r>
-        <w:t>Type shows Track Defect, and the picklist is restricted to the six NYCT values if you click Edit (proves Type customization + per-Record-Type restriction)</w:t>
+        <w:t xml:space="preserve">• Type shows Track Defect, and the picklist is restricted to the six NYCT values if you click Edit (proves Type customization + per-Record-Type restriction)</w:t>
       </w:r>
     </w:p>
     <w:p>
@@ -3573,10 +3516,7 @@
         <w:ind w:left="680" w:hanging="227"/>
       </w:pPr>
       <w:r>
-        <w:t xml:space="preserve">• </w:t>
-      </w:r>
-      <w:r>
-        <w:t>Reported Date/Time is populated and visible on the canvas (proves Part 9 placed it correctly)</w:t>
+        <w:t xml:space="preserve">• Reported Date/Time is populated and visible on the canvas (proves Part 9 placed it correctly)</w:t>
       </w:r>
     </w:p>
     <w:p>
@@ -3585,10 +3525,7 @@
         <w:ind w:left="680" w:hanging="227"/>
       </w:pPr>
       <w:r>
-        <w:t xml:space="preserve">• </w:t>
-      </w:r>
-      <w:r>
-        <w:t>Resolution Notes is visible on the canvas but empty (proves Part 9 placed it correctly)</w:t>
+        <w:t xml:space="preserve">• Resolution Notes is visible on the canvas but empty (proves Part 9 placed it correctly)</w:t>
       </w:r>
     </w:p>
     <w:p>
@@ -3597,10 +3534,7 @@
         <w:ind w:left="680" w:hanging="227"/>
       </w:pPr>
       <w:r>
-        <w:t xml:space="preserve">• </w:t>
-      </w:r>
-      <w:r>
-        <w:t>Contact Name is populated with the contact you chose</w:t>
+        <w:t xml:space="preserve">• Contact Name is populated with the contact you chose</w:t>
       </w:r>
     </w:p>
     <w:p>
@@ -3609,10 +3543,7 @@
         <w:ind w:left="680" w:hanging="227"/>
       </w:pPr>
       <w:r>
-        <w:t xml:space="preserve">• </w:t>
-      </w:r>
-      <w:r>
-        <w:t>Account Name shows MTA New York City Transit</w:t>
+        <w:t xml:space="preserve">• Account Name shows MTA New York City Transit</w:t>
       </w:r>
     </w:p>
     <w:p>

</xml_diff>

<commit_message>
r12: fix Case Page Layouts labeling, remove Case (Marketing) hallucination, drop Save-not-Done parenthetical
</commit_message>
<xml_diff>
--- a/workshop-site/labs/Lab 01 - Participant.docx
+++ b/workshop-site/labs/Lab 01 - Participant.docx
@@ -2217,11 +2217,9 @@
         <w:rPr>
           <w:b/>
         </w:rPr>
-        <w:t xml:space="preserve">1. </w:t>
-      </w:r>
-      <w:r>
-        <w:t>Navigate: From Setup, in the Quick Find box, type 'Object Manager', click it. Click Case. In the left sidebar, click 'Page Layouts' (NOT Lightning Record Pages or Compact Layouts, specifically Page Layouts).</w:t>
-      </w:r>
+        <w:t>1. Navigate: From Setup, in the Quick Find box, type 'Object Manager', click it. Click Case. In the left sidebar, click 'Case Page Layouts'.</w:t>
+      </w:r>
+      <w:r/>
     </w:p>
     <w:p>
       <w:pPr>
@@ -2232,11 +2230,9 @@
         <w:rPr>
           <w:b/>
         </w:rPr>
-        <w:t xml:space="preserve">2. </w:t>
-      </w:r>
-      <w:r>
-        <w:t>In the Page Layouts list, click the layout named 'Case Layout' (there may be other layouts named like 'Case (Marketing) Layout', click the one simply called 'Case Layout').</w:t>
-      </w:r>
+        <w:t>2. In the Page Layouts list, click the layout named 'Case Layout'.</w:t>
+      </w:r>
+      <w:r/>
     </w:p>
     <w:p>
       <w:pPr>
@@ -2430,7 +2426,7 @@
     </w:p>
     <w:p>
       <w:r>
-        <w:t>Navigate: Still on the Case Layout from section 6.2 (if you clicked away, return to Setup, Object Manager, Case, Page Layouts, click 'Case Layout').</w:t>
+        <w:t>Navigate: Still on the Case Layout from section 6.2 (if you clicked away, return to Setup, Object Manager, Case, Case Page Layouts, click 'Case Layout').</w:t>
       </w:r>
     </w:p>
     <w:p>
@@ -2475,11 +2471,9 @@
         <w:rPr>
           <w:b/>
         </w:rPr>
-        <w:t xml:space="preserve">1. </w:t>
-      </w:r>
-      <w:r>
-        <w:t>Navigate: From Setup, Object Manager, Case, click 'Page Layouts' in the left sidebar, then click the 'Page Layout Assignment' button at the top of the Page Layouts list.</w:t>
-      </w:r>
+        <w:t>1. Navigate: From Setup, Object Manager, Case, click 'Case Page Layouts' in the left sidebar, then click the 'Page Layout Assignment' button at the top of the Page Layouts list.</w:t>
+      </w:r>
+      <w:r/>
     </w:p>
     <w:p>
       <w:pPr>
@@ -2510,7 +2504,7 @@
     </w:p>
     <w:p>
       <w:r>
-        <w:t>Navigate: From Setup, Object Manager, Case, click 'Page Layouts' in the left sidebar, click 'Case Layout', then scroll down to the Related Lists section near the bottom of the canvas.</w:t>
+        <w:t>Navigate: From Setup, Object Manager, Case, click 'Case Page Layouts' in the left sidebar, click 'Case Layout', then scroll down to the Related Lists section near the bottom of the canvas.</w:t>
       </w:r>
     </w:p>
     <w:p>

</xml_diff>